<commit_message>
Add new haiku docs, hanko images, and update Cracked skin
Co-Authored-By: Claude Sonnet 5.5 <noreply@anthropic.com>
</commit_message>
<xml_diff>
--- a/Cracked skin.docx
+++ b/Cracked skin.docx
@@ -1,43 +1,9 @@
 
 <file path=word/document.xml><?xml version="1.0" encoding="utf-8"?>
 <w:document xmlns:wpc="http://schemas.microsoft.com/office/word/2010/wordprocessingCanvas" xmlns:mc="http://schemas.openxmlformats.org/markup-compatibility/2006" xmlns:o="urn:schemas-microsoft-com:office:office" xmlns:r="http://schemas.openxmlformats.org/officeDocument/2006/relationships" xmlns:m="http://schemas.openxmlformats.org/officeDocument/2006/math" xmlns:v="urn:schemas-microsoft-com:vml" xmlns:wp="http://schemas.openxmlformats.org/drawingml/2006/wordprocessingDrawing" xmlns:w="http://schemas.openxmlformats.org/wordprocessingml/2006/main" xmlns:wpg="http://schemas.microsoft.com/office/word/2010/wordprocessingGroup" xmlns:wpi="http://schemas.microsoft.com/office/word/2010/wordprocessingInk" xmlns:a="http://schemas.openxmlformats.org/drawingml/2006/main" xmlns:wne="http://schemas.microsoft.com/office/word/2006/wordml" xmlns:wps="http://schemas.microsoft.com/office/word/2010/wordprocessingShape" xmlns:w10="urn:schemas-microsoft-com:office:word" xmlns:wp14="http://schemas.microsoft.com/office/word/2010/wordprocessingDrawing" xmlns:w14="http://schemas.microsoft.com/office/word/2010/wordml" xmlns:w15="http://schemas.microsoft.com/office/word/2012/wordml" xmlns:w16cex="http://schemas.microsoft.com/office/word/2018/wordml/cex" xmlns:w16cid="http://schemas.microsoft.com/office/word/2016/wordml/cid" xmlns:w16="http://schemas.microsoft.com/office/word/2018/wordml" xmlns:w16sdtdh="http://schemas.microsoft.com/office/word/2020/wordml/sdtdatahash" xmlns:w16se="http://schemas.microsoft.com/office/word/2015/wordml/symex" mc:Ignorable="w14 w15 w16se w16cid w16 w16cex w16sdtdh wp14">
+  <w:background w:color="FFFFFF"/>
   <w:body>
-    <w:p>
-      <w:pPr>
-        <w:pBdr/>
-        <w:spacing/>
-        <w:ind/>
-        <w:jc w:val="right"/>
-        <w:rPr>
-          <w:sz w:val="12"/>
-          <w:szCs w:val="12"/>
-          <w:highlight w:val="none"/>
-        </w:rPr>
-      </w:pPr>
-      <w:r>
-        <w:rPr>
-          <w:rFonts w:ascii="Open Sans" w:hAnsi="Open Sans" w:eastAsia="Open Sans" w:cs="Open Sans"/>
-          <w:sz w:val="12"/>
-          <w:szCs w:val="12"/>
-          <w:highlight w:val="none"/>
-          <w:lang w:val="ja-JP"/>
-        </w:rPr>
-      </w:r>
-      <w:r>
-        <w:rPr>
-          <w:sz w:val="12"/>
-          <w:szCs w:val="12"/>
-          <w:highlight w:val="none"/>
-        </w:rPr>
-      </w:r>
-      <w:r>
-        <w:rPr>
-          <w:sz w:val="12"/>
-          <w:szCs w:val="12"/>
-          <w:highlight w:val="none"/>
-        </w:rPr>
-      </w:r>
-    </w:p>
+    <w:p/>
     <w:p>
       <w:pPr>
         <w:pBdr/>

</xml_diff>